<commit_message>
Update system prompt — add scope statement
</commit_message>
<xml_diff>
--- a/docs/system-prompt/EMS_SystemPrompt_v01.docx
+++ b/docs/system-prompt/EMS_SystemPrompt_v01.docx
@@ -78,6 +78,180 @@
           <w:szCs w:val="36"/>
         </w:rPr>
         <w:t xml:space="preserve">── SYSTEM PROMPT START ──</w:t>
+      </w:r>
+    </w:p>
+    <w:p>
+      <w:pPr>
+        <w:pBdr>
+          <w:bottom w:val="single" w:color="1A6B3C" w:sz="4" w:space="1"/>
+        </w:pBdr>
+        <w:spacing w:after="200" w:before="200"/>
+      </w:pPr>
+      <w:r>
+        <w:t xml:space="preserve"/>
+      </w:r>
+    </w:p>
+    <w:p>
+      <w:pPr>
+        <w:pStyle w:val="Heading2"/>
+        <w:spacing w:after="120" w:before="320"/>
+      </w:pPr>
+      <w:r>
+        <w:rPr>
+          <w:rFonts w:ascii="Georgia" w:cs="Georgia" w:eastAsia="Georgia" w:hAnsi="Georgia"/>
+          <w:b/>
+          <w:bCs/>
+          <w:color w:val="1A1A1A"/>
+          <w:sz w:val="28"/>
+          <w:szCs w:val="28"/>
+        </w:rPr>
+        <w:t xml:space="preserve">WHAT THIS FILE DOES AND DOESN'T DO</w:t>
+      </w:r>
+    </w:p>
+    <w:p>
+      <w:pPr>
+        <w:spacing w:after="100" w:before="80"/>
+      </w:pPr>
+      <w:r>
+        <w:rPr>
+          <w:rFonts w:ascii="Georgia" w:cs="Georgia" w:eastAsia="Georgia" w:hAnsi="Georgia"/>
+          <w:color w:val="1A1A1A"/>
+          <w:sz w:val="22"/>
+          <w:szCs w:val="22"/>
+        </w:rPr>
+        <w:t xml:space="preserve">This file turns Claude into an energy management system builder for your home. Load it into a Claude Project, describe your home and what you want, and Claude will generate the specific configuration — automations, device settings, Home Assistant config — to build it. You copy what it produces, paste it into Home Assistant, test it, and tell Claude what to adjust. That's the whole loop.</w:t>
+      </w:r>
+    </w:p>
+    <w:p>
+      <w:pPr>
+        <w:spacing w:after="100" w:before="80"/>
+      </w:pPr>
+      <w:r>
+        <w:rPr>
+          <w:rFonts w:ascii="Georgia" w:cs="Georgia" w:eastAsia="Georgia" w:hAnsi="Georgia"/>
+          <w:color w:val="1A1A1A"/>
+          <w:sz w:val="22"/>
+          <w:szCs w:val="22"/>
+        </w:rPr>
+        <w:t xml:space="preserve">What you get is a system fitted exactly to your home. Not a template you adapt. Not a product you configure. A system built through conversation, for your specific hardware, your utility rates, your schedule, and the way you actually live.</w:t>
+      </w:r>
+    </w:p>
+    <w:p>
+      <w:pPr>
+        <w:spacing w:after="80" w:before="240"/>
+      </w:pPr>
+      <w:r>
+        <w:rPr>
+          <w:rFonts w:ascii="Arial" w:cs="Arial" w:eastAsia="Arial" w:hAnsi="Arial"/>
+          <w:b/>
+          <w:bCs/>
+          <w:color w:val="1A6B3C"/>
+          <w:sz w:val="24"/>
+          <w:szCs w:val="24"/>
+        </w:rPr>
+        <w:t xml:space="preserve">What it does</w:t>
+      </w:r>
+    </w:p>
+    <w:p>
+      <w:pPr>
+        <w:spacing w:after="100" w:before="80"/>
+      </w:pPr>
+      <w:r>
+        <w:rPr>
+          <w:rFonts w:ascii="Georgia" w:cs="Georgia" w:eastAsia="Georgia" w:hAnsi="Georgia"/>
+          <w:color w:val="1A1A1A"/>
+          <w:sz w:val="22"/>
+          <w:szCs w:val="22"/>
+        </w:rPr>
+        <w:t xml:space="preserve">Helps you build a Home Assistant-based energy management system that knows when you're home and when you're not, manages your major loads — water heater, climate, phantom loads — around that, and if you have solar and battery storage, coordinates everything against what you're producing and what you have stored. It works at three levels: grid-only with smart management, add a battery, add full solar. Each level works on its own. Each one makes the next more valuable.</w:t>
+      </w:r>
+    </w:p>
+    <w:p>
+      <w:pPr>
+        <w:spacing w:after="80" w:before="240"/>
+      </w:pPr>
+      <w:r>
+        <w:rPr>
+          <w:rFonts w:ascii="Arial" w:cs="Arial" w:eastAsia="Arial" w:hAnsi="Arial"/>
+          <w:b/>
+          <w:bCs/>
+          <w:color w:val="1A6B3C"/>
+          <w:sz w:val="24"/>
+          <w:szCs w:val="24"/>
+        </w:rPr>
+        <w:t xml:space="preserve">What it doesn't do</w:t>
+      </w:r>
+    </w:p>
+    <w:p>
+      <w:pPr>
+        <w:spacing w:after="100" w:before="80"/>
+      </w:pPr>
+      <w:r>
+        <w:rPr>
+          <w:rFonts w:ascii="Georgia" w:cs="Georgia" w:eastAsia="Georgia" w:hAnsi="Georgia"/>
+          <w:color w:val="1A1A1A"/>
+          <w:sz w:val="22"/>
+          <w:szCs w:val="22"/>
+        </w:rPr>
+        <w:t xml:space="preserve">It doesn't install anything for you. You still need to run commands, paste YAML, and do some basic setup. Claude lowers the bar considerably — but this isn't a one-click installer. Expect a weekend to get the foundation working, and a few weeks of tuning before it feels dialed in.</w:t>
+      </w:r>
+    </w:p>
+    <w:p>
+      <w:pPr>
+        <w:spacing w:after="100" w:before="80"/>
+      </w:pPr>
+      <w:r>
+        <w:rPr>
+          <w:rFonts w:ascii="Georgia" w:cs="Georgia" w:eastAsia="Georgia" w:hAnsi="Georgia"/>
+          <w:color w:val="1A1A1A"/>
+          <w:sz w:val="22"/>
+          <w:szCs w:val="22"/>
+        </w:rPr>
+        <w:t xml:space="preserve">It doesn't cover fire detection or security cameras. Those are planned extensions. This version is energy management only.</w:t>
+      </w:r>
+    </w:p>
+    <w:p>
+      <w:pPr>
+        <w:spacing w:after="100" w:before="80"/>
+      </w:pPr>
+      <w:r>
+        <w:rPr>
+          <w:rFonts w:ascii="Georgia" w:cs="Georgia" w:eastAsia="Georgia" w:hAnsi="Georgia"/>
+          <w:color w:val="1A1A1A"/>
+          <w:sz w:val="22"/>
+          <w:szCs w:val="22"/>
+        </w:rPr>
+        <w:t xml:space="preserve">It doesn't work well if your phone is unreliable or you don't carry it. Location-based automation is the core of the system. If phone presence doesn't work for your situation, the system still works — it just needs a different trigger, which Claude can help you set up.</w:t>
+      </w:r>
+    </w:p>
+    <w:p>
+      <w:pPr>
+        <w:spacing w:after="100" w:before="80"/>
+      </w:pPr>
+      <w:r>
+        <w:rPr>
+          <w:rFonts w:ascii="Georgia" w:cs="Georgia" w:eastAsia="Georgia" w:hAnsi="Georgia"/>
+          <w:color w:val="1A1A1A"/>
+          <w:sz w:val="22"/>
+          <w:szCs w:val="22"/>
+        </w:rPr>
+        <w:t xml:space="preserve">It isn't finished. Some parts are more battle-tested than others. Claude will tell you which is which. The system gets better as more people build it and report back.</w:t>
+      </w:r>
+    </w:p>
+    <w:p>
+      <w:pPr>
+        <w:spacing w:after="100" w:before="80"/>
+      </w:pPr>
+      <w:r>
+        <w:rPr>
+          <w:rFonts w:ascii="Georgia" w:cs="Georgia" w:eastAsia="Georgia" w:hAnsi="Georgia"/>
+          <w:i/>
+          <w:iCs/>
+          <w:color w:val="1A1A1A"/>
+          <w:sz w:val="22"/>
+          <w:szCs w:val="22"/>
+        </w:rPr>
+        <w:t xml:space="preserve">The honest version in one sentence: this is a powerful system that requires some technical effort to build, will need tuning after you build it, and will deliver a real return on that investment — but it won't do the work for you.</w:t>
       </w:r>
     </w:p>
     <w:p>

</xml_diff>